<commit_message>
Reduce AppSettings/WebConfig label font size to 11pt
Both 'AppSettings.Config change(s)' and 'Web Config change(s)' label
runs were 12pt (sz=24); dropped to 11pt (sz=22) as requested. The
value runs (already 10pt/sz=20) are untouched.

Regenerated assets/master_template.docx and re-verified via the
existing functional fill test + rendered PDF.
</commit_message>
<xml_diff>
--- a/assets/master_template.docx
+++ b/assets/master_template.docx
@@ -6778,8 +6778,8 @@
         <w:rPr>
           <w:rFonts w:eastAsia="Calibri" w:cs="Calibri"/>
           <w:color w:val="000000"/>
-          <w:sz w:val="24"/>
-          <w:szCs w:val="24"/>
+          <w:sz w:val="22"/>
+          <w:szCs w:val="22"/>
         </w:rPr>
         <w:t xml:space="preserve">AppSettings.Config change(s) - </w:t>
       </w:r>
@@ -6802,8 +6802,8 @@
         <w:rPr>
           <w:rFonts w:eastAsia="Calibri" w:cs="Calibri"/>
           <w:color w:val="000000"/>
-          <w:sz w:val="24"/>
-          <w:szCs w:val="24"/>
+          <w:sz w:val="22"/>
+          <w:szCs w:val="22"/>
         </w:rPr>
         <w:t>Web Config change(s)</w:t>
       </w:r>

</xml_diff>

<commit_message>
Normalize table row heights (fixes Tasks Completed's non-autofit rows)
Root cause of the visible 'puffy' row in Tasks Completed: its data row
had a minimum height of 608 dxa (~0.42in), left over from its own
independently-authored table in the base doc, versus Requirements/
CDD's tightly content-fit 183 dxa. Business Configuration's rows
(240/237) were also off, just less noticeably.

Aligned all four ticket tables' header and data row heights to
Requirements/CDD's values (331 header / 183 data), the same normalization
pattern already applied to font, size, column widths, and header color
in the previous round.

Verified via the functional fill test + rendered PDF at 200 DPI:
Tasks Completed's rows now hug their content exactly like every other
ticket table's rows, and both the populated and empty-fallback outputs
still validate cleanly.
</commit_message>
<xml_diff>
--- a/assets/master_template.docx
+++ b/assets/master_template.docx
@@ -5149,7 +5149,7 @@
       </w:tblGrid>
       <w:tr>
         <w:trPr>
-          <w:trHeight w:val="240"/>
+          <w:trHeight w:val="331"/>
         </w:trPr>
         <w:tc>
           <w:tcPr>
@@ -5311,7 +5311,7 @@
       <!--ROW:BIZCONFIG-->
       <w:tr>
         <w:trPr>
-          <w:trHeight w:val="237"/>
+          <w:trHeight w:val="183"/>
         </w:trPr>
         <w:tc>
           <w:tcPr>
@@ -6048,7 +6048,7 @@
       <w:tr>
         <w:trPr>
           <w:cantSplit/>
-          <w:trHeight w:val="311"/>
+          <w:trHeight w:val="331"/>
         </w:trPr>
         <w:tc>
           <w:tcPr>
@@ -6209,7 +6209,7 @@
       <w:tr>
         <w:trPr>
           <w:cantSplit/>
-          <w:trHeight w:val="608"/>
+          <w:trHeight w:val="183"/>
         </w:trPr>
         <w:tc>
           <w:tcPr>

</xml_diff>

<commit_message>
Standardize all ticket table row heights to exactly 0.4cm
Confirmed against Word's own Table Layout ribbon (0.4cm reported for
a single-line row) rather than the 331/183 dxa split I'd been using,
which undershot that real value for data rows. Unified header and
data row heights to 227 dxa (0.4cm) across all four ticket tables --
Business Configuration, Requirements, Tasks Completed, and Code Drop
Defects -- so they're not just proportioned and colored the same but
exactly the same height too.

Bumped TEMPLATE_VERSION to 2 (the cache-busting fix from the previous
commit) so this actually reaches browsers rather than being masked by
a stale cached copy of the docx, the same issue that hid the last
few rounds of table fixes.

Verified via the functional fill test + rendered PDF: all four
tables' rows now visually match at a consistent, comfortable height,
and both populated and empty-fallback outputs still validate cleanly.
</commit_message>
<xml_diff>
--- a/assets/master_template.docx
+++ b/assets/master_template.docx
@@ -5149,7 +5149,7 @@
       </w:tblGrid>
       <w:tr>
         <w:trPr>
-          <w:trHeight w:val="331"/>
+          <w:trHeight w:val="227"/>
         </w:trPr>
         <w:tc>
           <w:tcPr>
@@ -5311,7 +5311,7 @@
       <!--ROW:BIZCONFIG-->
       <w:tr>
         <w:trPr>
-          <w:trHeight w:val="183"/>
+          <w:trHeight w:val="227"/>
         </w:trPr>
         <w:tc>
           <w:tcPr>
@@ -5528,7 +5528,7 @@
       <w:tr>
         <w:trPr>
           <w:cantSplit/>
-          <w:trHeight w:val="331"/>
+          <w:trHeight w:val="227"/>
         </w:trPr>
         <w:tc>
           <w:tcPr>
@@ -5719,7 +5719,7 @@
       <w:tr w14:paraId="RQ0038C0">
         <w:trPr>
           <w:cantSplit/>
-          <w:trHeight w:val="183"/>
+          <w:trHeight w:val="227"/>
         </w:trPr>
         <w:tc>
           <w:tcPr>
@@ -6048,7 +6048,7 @@
       <w:tr>
         <w:trPr>
           <w:cantSplit/>
-          <w:trHeight w:val="331"/>
+          <w:trHeight w:val="227"/>
         </w:trPr>
         <w:tc>
           <w:tcPr>
@@ -6209,7 +6209,7 @@
       <w:tr>
         <w:trPr>
           <w:cantSplit/>
-          <w:trHeight w:val="183"/>
+          <w:trHeight w:val="227"/>
         </w:trPr>
         <w:tc>
           <w:tcPr>
@@ -6416,7 +6416,7 @@
       <w:tr>
         <w:trPr>
           <w:cantSplit/>
-          <w:trHeight w:val="331"/>
+          <w:trHeight w:val="227"/>
         </w:trPr>
         <w:tc>
           <w:tcPr>
@@ -6607,7 +6607,7 @@
       <w:tr>
         <w:trPr>
           <w:cantSplit/>
-          <w:trHeight w:val="183"/>
+          <w:trHeight w:val="227"/>
         </w:trPr>
         <w:tc>
           <w:tcPr>

</xml_diff>

<commit_message>
Fix Document Revision History table header color to match the rest
This table uses a built-in Word table style (ListTable4-Accent4)
rather than inline per-cell shading like every other table in the
doc, so its header rendered in that style's own accent color instead
of the literal navy (104861) used everywhere else. Added explicit
inline shading to just its 4 header cells (Date/Description/Version/
Author) -- header text was already white, so no other change needed.

Bumped TEMPLATE_VERSION to 3 so this reaches browsers via the
cache-busting fix from two commits ago.

Verified via the functional fill test + rendered PDF: header now
matches the same navy as every other table's header, and both
populated and empty-fallback outputs still validate cleanly.
</commit_message>
<xml_diff>
--- a/assets/master_template.docx
+++ b/assets/master_template.docx
@@ -2625,6 +2625,7 @@
           <w:tcPr>
             <w:cnfStyle w:val="001000000000" w:firstRow="0" w:lastRow="0" w:firstColumn="1" w:lastColumn="0" w:oddVBand="0" w:evenVBand="0" w:oddHBand="0" w:evenHBand="0" w:firstRowFirstColumn="0" w:firstRowLastColumn="0" w:lastRowFirstColumn="0" w:lastRowLastColumn="0"/>
             <w:tcW w:w="1000" w:type="pct"/>
+            <w:shd w:val="clear" w:color="auto" w:fill="104861"/>
           </w:tcPr>
           <w:p>
             <w:pPr>
@@ -2647,6 +2648,7 @@
         <w:tc>
           <w:tcPr>
             <w:tcW w:w="2000" w:type="pct"/>
+            <w:shd w:val="clear" w:color="auto" w:fill="104861"/>
           </w:tcPr>
           <w:p>
             <w:pPr>
@@ -2670,6 +2672,7 @@
         <w:tc>
           <w:tcPr>
             <w:tcW w:w="579" w:type="pct"/>
+            <w:shd w:val="clear" w:color="auto" w:fill="104861"/>
           </w:tcPr>
           <w:p>
             <w:pPr>
@@ -2693,6 +2696,7 @@
         <w:tc>
           <w:tcPr>
             <w:tcW w:w="1421" w:type="pct"/>
+            <w:shd w:val="clear" w:color="auto" w:fill="104861"/>
           </w:tcPr>
           <w:p>
             <w:pPr>

</xml_diff>

<commit_message>
Reduce section heading size from 16pt to 14pt
All major section headings (Business Configuration, Requirements,
Migration, E2E Scenarios, Tasks Completed, Code Drop Defects, Release
Details, Environment Summary, Technical Configuration, Release
Request Package(s)) share the same 'Heading2' paragraph style, so
this is a one-line fix at the style level in styles.xml rather than
touching each heading individually -- keeps every heading in the
document consistent with each other rather than singling out just the
ones visible in the reported screenshot.

Verified via the functional fill test + rendered PDF: every heading
across pages 3-5 (including ones not shown in the original report,
like Technical Configuration and Release Request Package(s)) now
renders at the smaller size, and both populated/empty-fallback outputs
still validate cleanly. Bumped both TEMPLATE_VERSION (7) and the outer
index.html asset version (v=18) together this time.
</commit_message>
<xml_diff>
--- a/assets/master_template.docx
+++ b/assets/master_template.docx
@@ -12356,8 +12356,8 @@
     <w:rPr>
       <w:rFonts w:asciiTheme="majorHAnsi" w:eastAsiaTheme="majorEastAsia" w:hAnsiTheme="majorHAnsi" w:cstheme="majorBidi"/>
       <w:color w:val="0F4761" w:themeColor="accent1" w:themeShade="BF"/>
-      <w:sz w:val="32"/>
-      <w:szCs w:val="32"/>
+      <w:sz w:val="28"/>
+      <w:szCs w:val="28"/>
     </w:rPr>
   </w:style>
   <w:style w:type="paragraph" w:styleId="Heading3">

</xml_diff>